<commit_message>
Number the PTB rules as seven in both manuals.
Co-authored-by: Cursor <cursoragent@cursor.com>
</commit_message>
<xml_diff>
--- a/High-Precision-AV-Stimulation-Manual.docx
+++ b/High-Precision-AV-Stimulation-Manual.docx
@@ -2492,13 +2492,13 @@
       </w:r>
     </w:p>
     <w:bookmarkEnd w:id="31"/>
-    <w:bookmarkStart w:id="32" w:name="core-algorithm-the-rules-that-held-up"/>
+    <w:bookmarkStart w:id="32" w:name="X9224f28ebe76d2ef3dd5564331cab0ad7ff7ba3"/>
     <w:p>
       <w:pPr>
         <w:pStyle w:val="Heading2"/>
       </w:pPr>
       <w:r>
-        <w:t xml:space="preserve">4. Core algorithm: the rules that held up</w:t>
+        <w:t xml:space="preserve">4. Core algorithm: seven PTB rules to memorize</w:t>
       </w:r>
     </w:p>
     <w:p>

</xml_diff>

<commit_message>
Fix English Mermaid diagrams that GitHub could not parse.
Co-authored-by: Cursor <cursoragent@cursor.com>
</commit_message>
<xml_diff>
--- a/High-Precision-AV-Stimulation-Manual.docx
+++ b/High-Precision-AV-Stimulation-Manual.docx
@@ -138,7 +138,7 @@
         <w:rPr>
           <w:rStyle w:val="VerbatimChar"/>
         </w:rPr>
-        <w:t xml:space="preserve">    participant P as Stimulus program (PTB)</w:t>
+        <w:t xml:space="preserve">    participant P as StimulusProgram</w:t>
       </w:r>
       <w:r>
         <w:br/>
@@ -147,7 +147,7 @@
         <w:rPr>
           <w:rStyle w:val="VerbatimChar"/>
         </w:rPr>
-        <w:t xml:space="preserve">    participant T as Trigger Box / serial</w:t>
+        <w:t xml:space="preserve">    participant T as TriggerBox</w:t>
       </w:r>
       <w:r>
         <w:br/>
@@ -156,7 +156,7 @@
         <w:rPr>
           <w:rStyle w:val="VerbatimChar"/>
         </w:rPr>
-        <w:t xml:space="preserve">    participant D as Display / sound card / earphone</w:t>
+        <w:t xml:space="preserve">    participant D as DisplayOrAudio</w:t>
       </w:r>
       <w:r>
         <w:br/>
@@ -165,7 +165,7 @@
         <w:rPr>
           <w:rStyle w:val="VerbatimChar"/>
         </w:rPr>
-        <w:t xml:space="preserve">    participant S as Participant (eye/ear)</w:t>
+        <w:t xml:space="preserve">    participant S as Participant</w:t>
       </w:r>
       <w:r>
         <w:br/>
@@ -174,7 +174,7 @@
         <w:rPr>
           <w:rStyle w:val="VerbatimChar"/>
         </w:rPr>
-        <w:t xml:space="preserve">    participant N as NI acquisition card</w:t>
+        <w:t xml:space="preserve">    participant N as NICard</w:t>
       </w:r>
       <w:r>
         <w:br/>
@@ -183,7 +183,7 @@
         <w:rPr>
           <w:rStyle w:val="VerbatimChar"/>
         </w:rPr>
-        <w:t xml:space="preserve">    P-&gt;&gt;T: IOPort Write(255)</w:t>
+        <w:t xml:space="preserve">    P-&gt;&gt;T: IOPort Write 255</w:t>
       </w:r>
       <w:r>
         <w:br/>
@@ -192,7 +192,7 @@
         <w:rPr>
           <w:rStyle w:val="VerbatimChar"/>
         </w:rPr>
-        <w:t xml:space="preserve">    T-&gt;&gt;N: square-wave rising edge (t0)</w:t>
+        <w:t xml:space="preserve">    T-&gt;&gt;N: square-wave rising edge, t0</w:t>
       </w:r>
       <w:r>
         <w:br/>
@@ -201,7 +201,7 @@
         <w:rPr>
           <w:rStyle w:val="VerbatimChar"/>
         </w:rPr>
-        <w:t xml:space="preserve">    P-&gt;&gt;D: Flip frame / Start audio</w:t>
+        <w:t xml:space="preserve">    P-&gt;&gt;D: Flip frame or Start audio</w:t>
       </w:r>
       <w:r>
         <w:br/>
@@ -210,7 +210,7 @@
         <w:rPr>
           <w:rStyle w:val="VerbatimChar"/>
         </w:rPr>
-        <w:t xml:space="preserve">    D-&gt;&gt;S: light/sound truly arrives (t1)</w:t>
+        <w:t xml:space="preserve">    D-&gt;&gt;S: light or sound arrives, t1</w:t>
       </w:r>
       <w:r>
         <w:br/>
@@ -219,7 +219,7 @@
         <w:rPr>
           <w:rStyle w:val="VerbatimChar"/>
         </w:rPr>
-        <w:t xml:space="preserve">    S-&gt;&gt;N: photodiode / microphone records t1</w:t>
+        <w:t xml:space="preserve">    S-&gt;&gt;N: photodiode or microphone records t1</w:t>
       </w:r>
       <w:r>
         <w:br/>
@@ -228,7 +228,7 @@
         <w:rPr>
           <w:rStyle w:val="VerbatimChar"/>
         </w:rPr>
-        <w:t xml:space="preserve">    Note over T,N: delay = t1 - t0; must be measured and compensated</w:t>
+        <w:t xml:space="preserve">    Note over T,N: delay is t1 minus t0, measure and compensate</w:t>
       </w:r>
     </w:p>
     <w:p>
@@ -840,7 +840,7 @@
         <w:rPr>
           <w:rStyle w:val="VerbatimChar"/>
         </w:rPr>
-        <w:t xml:space="preserve">    subgraph A[Stimulation system]</w:t>
+        <w:t xml:space="preserve">    subgraph stim [Stimulation system]</w:t>
       </w:r>
       <w:r>
         <w:br/>
@@ -849,7 +849,7 @@
         <w:rPr>
           <w:rStyle w:val="VerbatimChar"/>
         </w:rPr>
-        <w:t xml:space="preserve">        PC[Desktop PC + discrete AMD GPU]</w:t>
+        <w:t xml:space="preserve">        PC["Desktop PC, discrete AMD GPU"]</w:t>
       </w:r>
       <w:r>
         <w:br/>
@@ -858,7 +858,7 @@
         <w:rPr>
           <w:rStyle w:val="VerbatimChar"/>
         </w:rPr>
-        <w:t xml:space="preserve">        PROJ[Projector / high-refresh screen]</w:t>
+        <w:t xml:space="preserve">        PROJ["Projector or high-refresh screen"]</w:t>
       </w:r>
       <w:r>
         <w:br/>
@@ -867,7 +867,7 @@
         <w:rPr>
           <w:rStyle w:val="VerbatimChar"/>
         </w:rPr>
-        <w:t xml:space="preserve">        HP[Earphone / air tube]</w:t>
+        <w:t xml:space="preserve">        HP["Earphone or air tube"]</w:t>
       </w:r>
       <w:r>
         <w:br/>
@@ -876,7 +876,7 @@
         <w:rPr>
           <w:rStyle w:val="VerbatimChar"/>
         </w:rPr>
-        <w:t xml:space="preserve">        TB[Trigger Box&lt;br/&gt;serial]</w:t>
+        <w:t xml:space="preserve">        TB["Trigger Box, serial"]</w:t>
       </w:r>
       <w:r>
         <w:br/>
@@ -903,7 +903,7 @@
         <w:rPr>
           <w:rStyle w:val="VerbatimChar"/>
         </w:rPr>
-        <w:t xml:space="preserve">        PC --&gt;|/dev/ttyUSB0| TB</w:t>
+        <w:t xml:space="preserve">        PC --&gt;|ttyUSB0| TB</w:t>
       </w:r>
       <w:r>
         <w:br/>
@@ -921,7 +921,7 @@
         <w:rPr>
           <w:rStyle w:val="VerbatimChar"/>
         </w:rPr>
-        <w:t xml:space="preserve">    subgraph B[Calibration rig - only for delay measurement]</w:t>
+        <w:t xml:space="preserve">    subgraph cal [Calibration rig]</w:t>
       </w:r>
       <w:r>
         <w:br/>
@@ -930,7 +930,7 @@
         <w:rPr>
           <w:rStyle w:val="VerbatimChar"/>
         </w:rPr>
-        <w:t xml:space="preserve">        PD[Photodiode on white patch]</w:t>
+        <w:t xml:space="preserve">        PD["Photodiode on white patch"]</w:t>
       </w:r>
       <w:r>
         <w:br/>
@@ -939,7 +939,7 @@
         <w:rPr>
           <w:rStyle w:val="VerbatimChar"/>
         </w:rPr>
-        <w:t xml:space="preserve">        MIC[Microphone at earphone outlet]</w:t>
+        <w:t xml:space="preserve">        MIC["Microphone at earphone"]</w:t>
       </w:r>
       <w:r>
         <w:br/>
@@ -948,7 +948,7 @@
         <w:rPr>
           <w:rStyle w:val="VerbatimChar"/>
         </w:rPr>
-        <w:t xml:space="preserve">        NI[NI cDAQ9171&lt;br/&gt;10 kHz 3-channel sync]</w:t>
+        <w:t xml:space="preserve">        NI["NI cDAQ9171, 10 kHz, 3 ch"]</w:t>
       </w:r>
       <w:r>
         <w:br/>
@@ -993,7 +993,7 @@
         <w:rPr>
           <w:rStyle w:val="VerbatimChar"/>
         </w:rPr>
-        <w:t xml:space="preserve">    PROJ -.light.-&gt; PD</w:t>
+        <w:t xml:space="preserve">    PROJ -.-&gt;|light| PD</w:t>
       </w:r>
       <w:r>
         <w:br/>
@@ -1002,7 +1002,7 @@
         <w:rPr>
           <w:rStyle w:val="VerbatimChar"/>
         </w:rPr>
-        <w:t xml:space="preserve">    HP -.sound.-&gt; MIC</w:t>
+        <w:t xml:space="preserve">    HP -.-&gt;|sound| MIC</w:t>
       </w:r>
     </w:p>
     <w:p>
@@ -1491,7 +1491,7 @@
         <w:rPr>
           <w:rStyle w:val="VerbatimChar"/>
         </w:rPr>
-        <w:t xml:space="preserve">    U[Ubuntu 20.04.6 LTS] --&gt; K[linux-lowlatency kernel]</w:t>
+        <w:t xml:space="preserve">    U["Ubuntu 20.04.6 LTS"] --&gt; K["linux-lowlatency kernel"]</w:t>
       </w:r>
       <w:r>
         <w:br/>
@@ -1500,7 +1500,7 @@
         <w:rPr>
           <w:rStyle w:val="VerbatimChar"/>
         </w:rPr>
-        <w:t xml:space="preserve">    K --&gt; M[MATLAB 2020b / Octave]</w:t>
+        <w:t xml:space="preserve">    K --&gt; M["MATLAB 2020b or Octave"]</w:t>
       </w:r>
       <w:r>
         <w:br/>
@@ -1509,7 +1509,7 @@
         <w:rPr>
           <w:rStyle w:val="VerbatimChar"/>
         </w:rPr>
-        <w:t xml:space="preserve">    M --&gt; P[PTB 3.0.21 unzip + setuppsychtoolbox]</w:t>
+        <w:t xml:space="preserve">    M --&gt; P["PTB 3.0.21 unzip and setup"]</w:t>
       </w:r>
       <w:r>
         <w:br/>
@@ -1518,7 +1518,7 @@
         <w:rPr>
           <w:rStyle w:val="VerbatimChar"/>
         </w:rPr>
-        <w:t xml:space="preserve">    U --&gt; G[Full GStreamer stack]</w:t>
+        <w:t xml:space="preserve">    U --&gt; G["Full GStreamer stack"]</w:t>
       </w:r>
       <w:r>
         <w:br/>
@@ -1527,7 +1527,7 @@
         <w:rPr>
           <w:rStyle w:val="VerbatimChar"/>
         </w:rPr>
-        <w:t xml:space="preserve">    U --&gt; X[XOrg + Wayland disabled&lt;br/&gt;XOrgConfCreator for screens]</w:t>
+        <w:t xml:space="preserve">    U --&gt; X["XOrg, Wayland off, XOrgConfCreator"]</w:t>
       </w:r>
       <w:r>
         <w:br/>
@@ -1536,7 +1536,7 @@
         <w:rPr>
           <w:rStyle w:val="VerbatimChar"/>
         </w:rPr>
-        <w:t xml:space="preserve">    P --&gt; C[PsychLinuxConfiguration&lt;br/&gt;Priority elevation]</w:t>
+        <w:t xml:space="preserve">    P --&gt; C["PsychLinuxConfiguration, raise Priority"]</w:t>
       </w:r>
     </w:p>
     <w:p>
@@ -4414,7 +4414,7 @@
         <w:rPr>
           <w:rStyle w:val="VerbatimChar"/>
         </w:rPr>
-        <w:t xml:space="preserve">    R[NI 3-channel sync @10kHz] --&gt; F{Filter}</w:t>
+        <w:t xml:space="preserve">    R["NI 3-channel sync at 10 kHz"] --&gt; F{Filter}</w:t>
       </w:r>
       <w:r>
         <w:br/>
@@ -4423,7 +4423,7 @@
         <w:rPr>
           <w:rStyle w:val="VerbatimChar"/>
         </w:rPr>
-        <w:t xml:space="preserve">    F --&gt;|audio| T1[Threshold rising edge]</w:t>
+        <w:t xml:space="preserve">    F --&gt;|audio| T1["Threshold rising edge"]</w:t>
       </w:r>
       <w:r>
         <w:br/>
@@ -4432,7 +4432,7 @@
         <w:rPr>
           <w:rStyle w:val="VerbatimChar"/>
         </w:rPr>
-        <w:t xml:space="preserve">    F --&gt;|light| T2[Notch 48-52Hz + lowpass&lt;br/&gt;then threshold/peak]</w:t>
+        <w:t xml:space="preserve">    F --&gt;|light| T2["Notch 48-52 Hz, then lowpass, then peak"]</w:t>
       </w:r>
       <w:r>
         <w:br/>
@@ -4441,7 +4441,7 @@
         <w:rPr>
           <w:rStyle w:val="VerbatimChar"/>
         </w:rPr>
-        <w:t xml:space="preserve">    T1 --&gt; D[delay = t_stim - t_trigger]</w:t>
+        <w:t xml:space="preserve">    T1 --&gt; D["delay is t stim minus t trigger"]</w:t>
       </w:r>
       <w:r>
         <w:br/>
@@ -4459,7 +4459,7 @@
         <w:rPr>
           <w:rStyle w:val="VerbatimChar"/>
         </w:rPr>
-        <w:t xml:space="preserve">    D --&gt; S[Mean±SD + drop first trial + count outliers]</w:t>
+        <w:t xml:space="preserve">    D --&gt; S["Mean and SD, drop first trial, count outliers"]</w:t>
       </w:r>
     </w:p>
     <w:p>
@@ -4824,7 +4824,7 @@
         <w:rPr>
           <w:rStyle w:val="VerbatimChar"/>
         </w:rPr>
-        <w:t xml:space="preserve">    A[Free run once, no compensation&lt;br/&gt;measure natural light-sound gap D] --&gt; B{Who is faster?}</w:t>
+        <w:t xml:space="preserve">    A["Free run once, no compensation. Measure light-sound gap D"] --&gt; B{Who is faster}</w:t>
       </w:r>
       <w:r>
         <w:br/>
@@ -4833,7 +4833,7 @@
         <w:rPr>
           <w:rStyle w:val="VerbatimChar"/>
         </w:rPr>
-        <w:t xml:space="preserve">    B --&gt;|audio faster, usual without a tube| C[PredictVisualOnset pushes vision 1 frame later&lt;br/&gt;Start audio at that later time plus a trim]</w:t>
+        <w:t xml:space="preserve">    B --&gt;|audio faster no tube| C["Push vision 1 frame later, then trim the audio start"]</w:t>
       </w:r>
       <w:r>
         <w:br/>
@@ -4842,7 +4842,7 @@
         <w:rPr>
           <w:rStyle w:val="VerbatimChar"/>
         </w:rPr>
-        <w:t xml:space="preserve">    B --&gt;|audio slower, air tube about +10 ms| D[PredictVisualOnset pushes vision N frames later&lt;br/&gt;until vision is the slower one&lt;br/&gt;then add audio delay to catch up]</w:t>
+        <w:t xml:space="preserve">    B --&gt;|audio slower with tube| D["Push vision N frames until it is slower, then delay audio to catch up"]</w:t>
       </w:r>
       <w:r>
         <w:br/>
@@ -4851,7 +4851,7 @@
         <w:rPr>
           <w:rStyle w:val="VerbatimChar"/>
         </w:rPr>
-        <w:t xml:space="preserve">    C --&gt; E[Trim audioExtraDelay by ±1 ms&lt;br/&gt;until sound minus light is about 0 ±0.2 ms]</w:t>
+        <w:t xml:space="preserve">    C --&gt; E["Trim audioExtraDelay by 1 ms until sound minus light is near 0"]</w:t>
       </w:r>
       <w:r>
         <w:br/>
@@ -6331,7 +6331,7 @@
         <w:rPr>
           <w:rStyle w:val="VerbatimChar"/>
         </w:rPr>
-        <w:t xml:space="preserve">    S1[Boot Ubuntu-XOrg&lt;br/&gt;confirm res/refresh with xrandr] --&gt; S2[Click top-right once - anti-pageflip bug]</w:t>
+        <w:t xml:space="preserve">    S1["Boot Ubuntu XOrg, check resolution and refresh"] --&gt; S2["Click top-right once, avoid pageflip bug"]</w:t>
       </w:r>
       <w:r>
         <w:br/>
@@ -6340,7 +6340,7 @@
         <w:rPr>
           <w:rStyle w:val="VerbatimChar"/>
         </w:rPr>
-        <w:t xml:space="preserve">    S2 --&gt; S3[Open MATLAB, cd to PTB folder, warm-up run]</w:t>
+        <w:t xml:space="preserve">    S2 --&gt; S3["Open MATLAB in the PTB folder, warm-up run"]</w:t>
       </w:r>
       <w:r>
         <w:br/>
@@ -6349,7 +6349,7 @@
         <w:rPr>
           <w:rStyle w:val="VerbatimChar"/>
         </w:rPr>
-        <w:t xml:space="preserve">    S3 --&gt; S4[Attach photodiode/mic, start NI]</w:t>
+        <w:t xml:space="preserve">    S3 --&gt; S4["Attach photodiode and mic, start NI"]</w:t>
       </w:r>
       <w:r>
         <w:br/>
@@ -6358,7 +6358,7 @@
         <w:rPr>
           <w:rStyle w:val="VerbatimChar"/>
         </w:rPr>
-        <w:t xml:space="preserve">    S4 --&gt; S5[100-trial short calibration: Mean±SD + miss count]</w:t>
+        <w:t xml:space="preserve">    S4 --&gt; S5["100-trial check, mean SD and miss count"]</w:t>
       </w:r>
       <w:r>
         <w:br/>
@@ -6367,7 +6367,7 @@
         <w:rPr>
           <w:rStyle w:val="VerbatimChar"/>
         </w:rPr>
-        <w:t xml:space="preserve">    S5 --&gt;|out of spec| T[Troubleshoot per §7]</w:t>
+        <w:t xml:space="preserve">    S5 --&gt;|out of spec| T["Troubleshoot, section 7"]</w:t>
       </w:r>
       <w:r>
         <w:br/>
@@ -6385,7 +6385,7 @@
         <w:rPr>
           <w:rStyle w:val="VerbatimChar"/>
         </w:rPr>
-        <w:t xml:space="preserve">    S5 --&gt;|in spec| S6[1000+ formal trials, drop first, archive]</w:t>
+        <w:t xml:space="preserve">    S5 --&gt;|in spec| S6["1000 formal trials, drop first, archive"]</w:t>
       </w:r>
       <w:r>
         <w:br/>
@@ -6394,7 +6394,7 @@
         <w:rPr>
           <w:rStyle w:val="VerbatimChar"/>
         </w:rPr>
-        <w:t xml:space="preserve">    S6 --&gt; S7[Offline filter + edge stats, write report]</w:t>
+        <w:t xml:space="preserve">    S6 --&gt; S7["Offline filter, edge stats, write report"]</w:t>
       </w:r>
     </w:p>
     <w:p>

</xml_diff>

<commit_message>
Rebuild both Word manuals from the latest markdown.
Co-authored-by: Cursor <cursoragent@cursor.com>
</commit_message>
<xml_diff>
--- a/High-Precision-AV-Stimulation-Manual.docx
+++ b/High-Precision-AV-Stimulation-Manual.docx
@@ -6548,7 +6548,7 @@
         <w:rPr>
           <w:rStyle w:val="VerbatimChar"/>
         </w:rPr>
-        <w:t xml:space="preserve">Flip(window, when+0.015)</w:t>
+        <w:t xml:space="preserve">Flip(window, onset+ifi*0.5)</w:t>
       </w:r>
       <w:r>
         <w:t xml:space="preserve">; hold with</w:t>
@@ -6629,7 +6629,7 @@
         </w:numPr>
       </w:pPr>
       <w:r>
-        <w:t xml:space="preserve">Statistics: drop first trial; targets: vision ±0.4 ms / audio ±0.1 ms / AV ±0.25 ms; 240 Hz full-speed reaches ±0.05 ms.</w:t>
+        <w:t xml:space="preserve">Statistics: drop first trial; targets: vision ±0.1 ms / audio ±0.1 ms / AV ±0.25 ms; 240 Hz full-speed reaches ±0.05 ms.</w:t>
       </w:r>
     </w:p>
     <w:p>

</xml_diff>